<commit_message>
Recheck fixes: underline remaining links, bring docs and report up to date
- Login, register and reset-password links, and product names in the table, are always underlined
  (they only underlined on hover). An automatic scan of 11 pages now finds no text-only actions.
- result.md / implementation.md: QGIS replaced by the location services actually used, current
  to-do list, demo script, known limits, and a section on PRs #2-#6. tasks/ marked historical.
- Status report (docx) regenerated with the current state; screenshots refreshed.
</commit_message>
<xml_diff>
--- a/docs/OpenELabel_Status_Report_2026-10-10.docx
+++ b/docs/OpenELabel_Status_Report_2026-10-10.docx
@@ -39,7 +39,7 @@
         <w:spacing w:after="120"/>
       </w:pPr>
       <w:r>
-        <w:t xml:space="preserve">All tasks agreed in the meeting are built and tested in Docker. The app now prints a standard wine label with the DPP QR code, links ingredients to products, and stores QR scan locations for QGIS. Rohan’s manufacturing-location work is merged in. What is left is mostly setup on Supabase, merging the pull request, and connecting the Python QR tool.</w:t>
+        <w:t xml:space="preserve">The wine label, DPP QR code, public passport and manufacturing location are built, tested, and live on Render. Two production bugs (product creation and QR codes opening localhost) are fixed. The demo feedback on buttons and the README is done in pull request #6, which is ready to merge.</w:t>
       </w:r>
     </w:p>
     <w:p>
@@ -53,12 +53,12 @@
         </w:rPr>
         <w:t xml:space="preserve">Pull request: </w:t>
       </w:r>
-      <w:hyperlink w:history="1" r:id="rIddvwtjrkkfn4_ct_jww05f">
+      <w:hyperlink w:history="1" r:id="rIdbauy_jwy2fq9sxnvqbgih">
         <w:r>
           <w:rPr>
             <w:rStyle w:val="Hyperlink"/>
           </w:rPr>
-          <w:t xml:space="preserve">github.com/om-bagade2007/elabel_nextjs/pull/1</w:t>
+          <w:t xml:space="preserve">github.com/om-bagade2007/elabel_nextjs/pull/6</w:t>
         </w:r>
       </w:hyperlink>
     </w:p>
@@ -175,7 +175,7 @@
                 <w:sz w:val="20"/>
                 <w:szCs w:val="20"/>
               </w:rPr>
-              <w:t xml:space="preserve">Docker deployment (replaces Render)</w:t>
+              <w:t xml:space="preserve">Docker deployment</w:t>
             </w:r>
           </w:p>
         </w:tc>
@@ -203,7 +203,7 @@
                 <w:sz w:val="20"/>
                 <w:szCs w:val="20"/>
               </w:rPr>
-              <w:t xml:space="preserve">Fixed the broken Dockerfile, added docker-compose.yml. Image builds, container is healthy. 845 MB (was 1.34 GB).</w:t>
+              <w:t xml:space="preserve">Dockerfile and docker-compose.yml work; image is healthy and runs as a non-root user. Render runs the live site.</w:t>
             </w:r>
           </w:p>
         </w:tc>
@@ -261,7 +261,7 @@
                 <w:sz w:val="20"/>
                 <w:szCs w:val="20"/>
               </w:rPr>
-              <w:t xml:space="preserve">New design system (wine colours, Gloock + Public Sans). All pages restyled; works on phones and desktop. Loading and empty states added.</w:t>
+              <w:t xml:space="preserve">New design system; all pages restyled; works on phones and desktop. Action elements now clearly look like buttons (demo feedback).</w:t>
             </w:r>
           </w:p>
         </w:tc>
@@ -319,7 +319,7 @@
                 <w:sz w:val="20"/>
                 <w:szCs w:val="20"/>
               </w:rPr>
-              <w:t xml:space="preserve">100 × 120 mm back label for a standard 750 ml bottle. Filled from the product form; empty fields stay blank. Download as SVG.</w:t>
+              <w:t xml:space="preserve">100 × 120 mm back label for a standard 750 ml bottle, filled from the product form; empty fields stay blank.</w:t>
             </w:r>
           </w:p>
         </w:tc>
@@ -349,7 +349,7 @@
                 <w:sz w:val="20"/>
                 <w:szCs w:val="20"/>
               </w:rPr>
-              <w:t xml:space="preserve">DPP QR code on the label</w:t>
+              <w:t xml:space="preserve">DPP QR code</w:t>
             </w:r>
           </w:p>
         </w:tc>
@@ -377,7 +377,7 @@
                 <w:sz w:val="20"/>
                 <w:szCs w:val="20"/>
               </w:rPr>
-              <w:t xml:space="preserve">Fixed position bottom-right, 25 mm. Generated locally; opens the product’s public passport page.</w:t>
+              <w:t xml:space="preserve">Fixed position on the label (25 mm). Download as SVG or PNG. Opens the public passport and never contains localhost.</w:t>
             </w:r>
           </w:p>
         </w:tc>
@@ -407,7 +407,7 @@
                 <w:sz w:val="20"/>
                 <w:szCs w:val="20"/>
               </w:rPr>
-              <w:t xml:space="preserve">Ingredients on products</w:t>
+              <w:t xml:space="preserve">Public passport page</w:t>
             </w:r>
           </w:p>
         </w:tc>
@@ -435,7 +435,7 @@
                 <w:sz w:val="20"/>
                 <w:szCs w:val="20"/>
               </w:rPr>
-              <w:t xml:space="preserve">Ingredients can be attached to a product in label order; allergens printed in bold.</w:t>
+              <w:t xml:space="preserve">No login, mobile-first. Addresses /qr/product/&lt;id&gt;, /dpp/&lt;id&gt; and /p/&lt;id&gt;.</w:t>
             </w:r>
           </w:p>
         </w:tc>
@@ -465,7 +465,7 @@
                 <w:sz w:val="20"/>
                 <w:szCs w:val="20"/>
               </w:rPr>
-              <w:t xml:space="preserve">QR scan locations for QGIS</w:t>
+              <w:t xml:space="preserve">Ingredients on products</w:t>
             </w:r>
           </w:p>
         </w:tc>
@@ -493,7 +493,7 @@
                 <w:sz w:val="20"/>
                 <w:szCs w:val="20"/>
               </w:rPr>
-              <w:t xml:space="preserve">Scans are stored with coordinates. QGIS loads them from a GeoJSON link. The Python tool can post scans to the same API.</w:t>
+              <w:t xml:space="preserve">Attached in label order; allergens printed in bold.</w:t>
             </w:r>
           </w:p>
         </w:tc>
@@ -523,7 +523,7 @@
                 <w:sz w:val="20"/>
                 <w:szCs w:val="20"/>
               </w:rPr>
-              <w:t xml:space="preserve">Merge with Rohan’s work</w:t>
+              <w:t xml:space="preserve">Manufacturing location</w:t>
             </w:r>
           </w:p>
         </w:tc>
@@ -551,7 +551,7 @@
                 <w:sz w:val="20"/>
                 <w:szCs w:val="20"/>
               </w:rPr>
-              <w:t xml:space="preserve">Rohan’s manufacturing-location and geolocation commit is merged and shown in the new design.</w:t>
+              <w:t xml:space="preserve">Device GPS, OpenStreetMap Nominatim, ipwho.is/ipapi.co fallback, manual entry; map view via Google Maps link.</w:t>
             </w:r>
           </w:p>
         </w:tc>
@@ -581,7 +581,7 @@
                 <w:sz w:val="20"/>
                 <w:szCs w:val="20"/>
               </w:rPr>
-              <w:t xml:space="preserve">GitHub</w:t>
+              <w:t xml:space="preserve">Fix: "Failed to create product"</w:t>
             </w:r>
           </w:p>
         </w:tc>
@@ -609,7 +609,7 @@
                 <w:sz w:val="20"/>
                 <w:szCs w:val="20"/>
               </w:rPr>
-              <w:t xml:space="preserve">Branch feature/docker-ui-label-qgis pushed; pull request #1 opened into main.</w:t>
+              <w:t xml:space="preserve">Database columns are now added automatically when the server starts (PR #2).</w:t>
             </w:r>
           </w:p>
         </w:tc>
@@ -639,7 +639,7 @@
                 <w:sz w:val="20"/>
                 <w:szCs w:val="20"/>
               </w:rPr>
-              <w:t xml:space="preserve">Documentation</w:t>
+              <w:t xml:space="preserve">Fix: QR opened localhost</w:t>
             </w:r>
           </w:p>
         </w:tc>
@@ -667,7 +667,65 @@
                 <w:sz w:val="20"/>
                 <w:szCs w:val="20"/>
               </w:rPr>
-              <w:t xml:space="preserve">README Docker + QGIS steps, implementation.md, result.md, screenshots in docs/screenshots.</w:t>
+              <w:t xml:space="preserve">QR codes use the public site address (PRs #3 and #4).</w:t>
+            </w:r>
+          </w:p>
+        </w:tc>
+      </w:tr>
+      <w:tr>
+        <w:tc>
+          <w:tcPr>
+            <w:tcW w:type="dxa" w:w="2800"/>
+            <w:tcBorders>
+              <w:top w:val="single" w:color="D9D6DE" w:sz="4"/>
+              <w:left w:val="single" w:color="D9D6DE" w:sz="4"/>
+              <w:bottom w:val="single" w:color="D9D6DE" w:sz="4"/>
+              <w:right w:val="single" w:color="D9D6DE" w:sz="4"/>
+            </w:tcBorders>
+            <w:tcMar>
+              <w:top w:type="dxa" w:w="80"/>
+              <w:left w:type="dxa" w:w="120"/>
+              <w:bottom w:type="dxa" w:w="80"/>
+              <w:right w:type="dxa" w:w="120"/>
+            </w:tcMar>
+          </w:tcPr>
+          <w:p>
+            <w:r>
+              <w:rPr>
+                <w:b w:val="false"/>
+                <w:bCs w:val="false"/>
+                <w:sz w:val="20"/>
+                <w:szCs w:val="20"/>
+              </w:rPr>
+              <w:t xml:space="preserve">README</w:t>
+            </w:r>
+          </w:p>
+        </w:tc>
+        <w:tc>
+          <w:tcPr>
+            <w:tcW w:type="dxa" w:w="6226"/>
+            <w:tcBorders>
+              <w:top w:val="single" w:color="D9D6DE" w:sz="4"/>
+              <w:left w:val="single" w:color="D9D6DE" w:sz="4"/>
+              <w:bottom w:val="single" w:color="D9D6DE" w:sz="4"/>
+              <w:right w:val="single" w:color="D9D6DE" w:sz="4"/>
+            </w:tcBorders>
+            <w:tcMar>
+              <w:top w:type="dxa" w:w="80"/>
+              <w:left w:type="dxa" w:w="120"/>
+              <w:bottom w:type="dxa" w:w="80"/>
+              <w:right w:type="dxa" w:w="120"/>
+            </w:tcMar>
+          </w:tcPr>
+          <w:p>
+            <w:r>
+              <w:rPr>
+                <w:b w:val="false"/>
+                <w:bCs w:val="false"/>
+                <w:sz w:val="20"/>
+                <w:szCs w:val="20"/>
+              </w:rPr>
+              <w:t xml:space="preserve">Index, step-by-step tutorial, Render and Docker deployment, Sentry setup with a verification checklist, troubleshooting (PRs #5 and #6).</w:t>
             </w:r>
           </w:p>
         </w:tc>
@@ -786,7 +844,7 @@
                 <w:sz w:val="20"/>
                 <w:szCs w:val="20"/>
               </w:rPr>
-              <w:t xml:space="preserve">QR code target</w:t>
+              <w:t xml:space="preserve">Buttons</w:t>
             </w:r>
           </w:p>
         </w:tc>
@@ -814,7 +872,7 @@
                 <w:sz w:val="20"/>
                 <w:szCs w:val="20"/>
               </w:rPr>
-              <w:t xml:space="preserve">Now opens the product passport page instead of the external link. No third-party QR website.</w:t>
+              <w:t xml:space="preserve">Auto-fetch location and Find coordinates are solid buttons; outline buttons have a visible border; links are underlined.</w:t>
             </w:r>
           </w:p>
         </w:tc>
@@ -844,7 +902,7 @@
                 <w:sz w:val="20"/>
                 <w:szCs w:val="20"/>
               </w:rPr>
-              <w:t xml:space="preserve">Product detail page</w:t>
+              <w:t xml:space="preserve">QR code target</w:t>
             </w:r>
           </w:p>
         </w:tc>
@@ -872,7 +930,7 @@
                 <w:sz w:val="20"/>
                 <w:szCs w:val="20"/>
               </w:rPr>
-              <w:t xml:space="preserve">Six tabs replaced by one page, with a label panel showing the label, downloads and the passport link.</w:t>
+              <w:t xml:space="preserve">Opens the product passport, not the external link; generated by the app itself.</w:t>
             </w:r>
           </w:p>
         </w:tc>
@@ -902,7 +960,7 @@
                 <w:sz w:val="20"/>
                 <w:szCs w:val="20"/>
               </w:rPr>
-              <w:t xml:space="preserve">Public passport page</w:t>
+              <w:t xml:space="preserve">Map links</w:t>
             </w:r>
           </w:p>
         </w:tc>
@@ -930,7 +988,7 @@
                 <w:sz w:val="20"/>
                 <w:szCs w:val="20"/>
               </w:rPr>
-              <w:t xml:space="preserve">Mobile-first; passport ID always visible; empty sections hidden; Redirect Link now works.</w:t>
+              <w:t xml:space="preserve">All map links open Google Maps. QGIS is no longer used.</w:t>
             </w:r>
           </w:p>
         </w:tc>
@@ -988,65 +1046,7 @@
                 <w:sz w:val="20"/>
                 <w:szCs w:val="20"/>
               </w:rPr>
-              <w:t xml:space="preserve">Fixed a bug that dropped warnings, saturates, sugar, protein and salt when editing.</w:t>
-            </w:r>
-          </w:p>
-        </w:tc>
-      </w:tr>
-      <w:tr>
-        <w:tc>
-          <w:tcPr>
-            <w:tcW w:type="dxa" w:w="2800"/>
-            <w:tcBorders>
-              <w:top w:val="single" w:color="D9D6DE" w:sz="4"/>
-              <w:left w:val="single" w:color="D9D6DE" w:sz="4"/>
-              <w:bottom w:val="single" w:color="D9D6DE" w:sz="4"/>
-              <w:right w:val="single" w:color="D9D6DE" w:sz="4"/>
-            </w:tcBorders>
-            <w:tcMar>
-              <w:top w:type="dxa" w:w="80"/>
-              <w:left w:type="dxa" w:w="120"/>
-              <w:bottom w:type="dxa" w:w="80"/>
-              <w:right w:type="dxa" w:w="120"/>
-            </w:tcMar>
-          </w:tcPr>
-          <w:p>
-            <w:r>
-              <w:rPr>
-                <w:b w:val="false"/>
-                <w:bCs w:val="false"/>
-                <w:sz w:val="20"/>
-                <w:szCs w:val="20"/>
-              </w:rPr>
-              <w:t xml:space="preserve">Navigation</w:t>
-            </w:r>
-          </w:p>
-        </w:tc>
-        <w:tc>
-          <w:tcPr>
-            <w:tcW w:type="dxa" w:w="6226"/>
-            <w:tcBorders>
-              <w:top w:val="single" w:color="D9D6DE" w:sz="4"/>
-              <w:left w:val="single" w:color="D9D6DE" w:sz="4"/>
-              <w:bottom w:val="single" w:color="D9D6DE" w:sz="4"/>
-              <w:right w:val="single" w:color="D9D6DE" w:sz="4"/>
-            </w:tcBorders>
-            <w:tcMar>
-              <w:top w:type="dxa" w:w="80"/>
-              <w:left w:type="dxa" w:w="120"/>
-              <w:bottom w:type="dxa" w:w="80"/>
-              <w:right w:type="dxa" w:w="120"/>
-            </w:tcMar>
-          </w:tcPr>
-          <w:p>
-            <w:r>
-              <w:rPr>
-                <w:b w:val="false"/>
-                <w:bCs w:val="false"/>
-                <w:sz w:val="20"/>
-                <w:szCs w:val="20"/>
-              </w:rPr>
-              <w:t xml:space="preserve">Menu now works on phones (it was hidden before).</w:t>
+              <w:t xml:space="preserve">Fixed a bug that dropped warnings and some nutrition values when editing.</w:t>
             </w:r>
           </w:p>
         </w:tc>
@@ -1281,7 +1281,7 @@
                 <w:sz w:val="20"/>
                 <w:szCs w:val="20"/>
               </w:rPr>
-              <w:t xml:space="preserve">Om / team</w:t>
+              <w:t xml:space="preserve">Team</w:t>
             </w:r>
           </w:p>
         </w:tc>
@@ -1309,7 +1309,7 @@
                 <w:sz w:val="20"/>
                 <w:szCs w:val="20"/>
               </w:rPr>
-              <w:t xml:space="preserve">They were public in the repository history. Urgent.</w:t>
+              <w:t xml:space="preserve">They are public in the repository history. Urgent.</w:t>
             </w:r>
           </w:p>
         </w:tc>
@@ -1339,7 +1339,7 @@
                 <w:sz w:val="20"/>
                 <w:szCs w:val="20"/>
               </w:rPr>
-              <w:t xml:space="preserve">Review and merge pull request #1</w:t>
+              <w:t xml:space="preserve">Merge PR #6</w:t>
             </w:r>
           </w:p>
         </w:tc>
@@ -1367,7 +1367,7 @@
                 <w:sz w:val="20"/>
                 <w:szCs w:val="20"/>
               </w:rPr>
-              <w:t xml:space="preserve">Om</w:t>
+              <w:t xml:space="preserve">Reviewer</w:t>
             </w:r>
           </w:p>
         </w:tc>
@@ -1395,7 +1395,7 @@
                 <w:sz w:val="20"/>
                 <w:szCs w:val="20"/>
               </w:rPr>
-              <w:t xml:space="preserve">github.com/om-bagade2007/elabel_nextjs/pull/1</w:t>
+              <w:t xml:space="preserve">github.com/om-bagade2007/elabel_nextjs/pull/6. Checks pass, no conflicts.</w:t>
             </w:r>
           </w:p>
         </w:tc>
@@ -1425,7 +1425,7 @@
                 <w:sz w:val="20"/>
                 <w:szCs w:val="20"/>
               </w:rPr>
-              <w:t xml:space="preserve">Set Supabase Session pooler URL in .env</w:t>
+              <w:t xml:space="preserve">Manual Deploy on Render</w:t>
             </w:r>
           </w:p>
         </w:tc>
@@ -1453,7 +1453,7 @@
                 <w:sz w:val="20"/>
                 <w:szCs w:val="20"/>
               </w:rPr>
-              <w:t xml:space="preserve">Om / team</w:t>
+              <w:t xml:space="preserve">Team</w:t>
             </w:r>
           </w:p>
         </w:tc>
@@ -1481,7 +1481,7 @@
                 <w:sz w:val="20"/>
                 <w:szCs w:val="20"/>
               </w:rPr>
-              <w:t xml:space="preserve">Direct database host is IPv6-only and Docker cannot reach it.</w:t>
+              <w:t xml:space="preserve">After merging. Then run the post-deploy checklist in the README.</w:t>
             </w:r>
           </w:p>
         </w:tc>
@@ -1511,7 +1511,7 @@
                 <w:sz w:val="20"/>
                 <w:szCs w:val="20"/>
               </w:rPr>
-              <w:t xml:space="preserve">Run the two SQL migrations in Supabase</w:t>
+              <w:t xml:space="preserve">Set BASE_URL on Render</w:t>
             </w:r>
           </w:p>
         </w:tc>
@@ -1539,7 +1539,7 @@
                 <w:sz w:val="20"/>
                 <w:szCs w:val="20"/>
               </w:rPr>
-              <w:t xml:space="preserve">Om / team</w:t>
+              <w:t xml:space="preserve">Team</w:t>
             </w:r>
           </w:p>
         </w:tc>
@@ -1567,7 +1567,7 @@
                 <w:sz w:val="20"/>
                 <w:szCs w:val="20"/>
               </w:rPr>
-              <w:t xml:space="preserve">add_manufacturing_columns.sql and add_ingredients_and_scans.sql (safe to re-run).</w:t>
+              <w:t xml:space="preserve">Still http://localhost:5000; set it to the Render address.</w:t>
             </w:r>
           </w:p>
         </w:tc>
@@ -1597,7 +1597,7 @@
                 <w:sz w:val="20"/>
                 <w:szCs w:val="20"/>
               </w:rPr>
-              <w:t xml:space="preserve">Deploy: docker compose up -d --build</w:t>
+              <w:t xml:space="preserve">Verify Sentry</w:t>
             </w:r>
           </w:p>
         </w:tc>
@@ -1625,7 +1625,7 @@
                 <w:sz w:val="20"/>
                 <w:szCs w:val="20"/>
               </w:rPr>
-              <w:t xml:space="preserve">Om</w:t>
+              <w:t xml:space="preserve">Teammate</w:t>
             </w:r>
           </w:p>
         </w:tc>
@@ -1653,7 +1653,7 @@
                 <w:sz w:val="20"/>
                 <w:szCs w:val="20"/>
               </w:rPr>
-              <w:t xml:space="preserve">On the machine that will host the demo; set BASE_URL to an address phones can reach.</w:t>
+              <w:t xml:space="preserve">Follow the Sentry checklist in the README on the live site.</w:t>
             </w:r>
           </w:p>
         </w:tc>
@@ -1683,7 +1683,7 @@
                 <w:sz w:val="20"/>
                 <w:szCs w:val="20"/>
               </w:rPr>
-              <w:t xml:space="preserve">Connect the Python QR tool</w:t>
+              <w:t xml:space="preserve">Reprint old QR codes</w:t>
             </w:r>
           </w:p>
         </w:tc>
@@ -1711,7 +1711,7 @@
                 <w:sz w:val="20"/>
                 <w:szCs w:val="20"/>
               </w:rPr>
-              <w:t xml:space="preserve">Rohan</w:t>
+              <w:t xml:space="preserve">Team</w:t>
             </w:r>
           </w:p>
         </w:tc>
@@ -1739,7 +1739,7 @@
                 <w:sz w:val="20"/>
                 <w:szCs w:val="20"/>
               </w:rPr>
-              <w:t xml:space="preserve">POST {productId, lat, lng, source} to /api/public/scans.</w:t>
+              <w:t xml:space="preserve">Any QR saved from a localhost copy before PR #4.</w:t>
             </w:r>
           </w:p>
         </w:tc>
@@ -1769,7 +1769,7 @@
                 <w:sz w:val="20"/>
                 <w:szCs w:val="20"/>
               </w:rPr>
-              <w:t xml:space="preserve">Add scans layer in QGIS</w:t>
+              <w:t xml:space="preserve">Next phase</w:t>
             </w:r>
           </w:p>
         </w:tc>
@@ -1797,7 +1797,7 @@
                 <w:sz w:val="20"/>
                 <w:szCs w:val="20"/>
               </w:rPr>
-              <w:t xml:space="preserve">Rohan</w:t>
+              <w:t xml:space="preserve">Team</w:t>
             </w:r>
           </w:p>
         </w:tc>
@@ -1825,93 +1825,7 @@
                 <w:sz w:val="20"/>
                 <w:szCs w:val="20"/>
               </w:rPr>
-              <w:t xml:space="preserve">Vector layer from BASE_URL/api/scans.geojson?key=… over an OpenStreetMap basemap.</w:t>
-            </w:r>
-          </w:p>
-        </w:tc>
-      </w:tr>
-      <w:tr>
-        <w:tc>
-          <w:tcPr>
-            <w:tcW w:type="dxa" w:w="3100"/>
-            <w:tcBorders>
-              <w:top w:val="single" w:color="D9D6DE" w:sz="4"/>
-              <w:left w:val="single" w:color="D9D6DE" w:sz="4"/>
-              <w:bottom w:val="single" w:color="D9D6DE" w:sz="4"/>
-              <w:right w:val="single" w:color="D9D6DE" w:sz="4"/>
-            </w:tcBorders>
-            <w:tcMar>
-              <w:top w:type="dxa" w:w="80"/>
-              <w:left w:type="dxa" w:w="120"/>
-              <w:bottom w:type="dxa" w:w="80"/>
-              <w:right w:type="dxa" w:w="120"/>
-            </w:tcMar>
-          </w:tcPr>
-          <w:p>
-            <w:r>
-              <w:rPr>
-                <w:b w:val="false"/>
-                <w:bCs w:val="false"/>
-                <w:sz w:val="20"/>
-                <w:szCs w:val="20"/>
-              </w:rPr>
-              <w:t xml:space="preserve">Later (DPP document)</w:t>
-            </w:r>
-          </w:p>
-        </w:tc>
-        <w:tc>
-          <w:tcPr>
-            <w:tcW w:type="dxa" w:w="1500"/>
-            <w:tcBorders>
-              <w:top w:val="single" w:color="D9D6DE" w:sz="4"/>
-              <w:left w:val="single" w:color="D9D6DE" w:sz="4"/>
-              <w:bottom w:val="single" w:color="D9D6DE" w:sz="4"/>
-              <w:right w:val="single" w:color="D9D6DE" w:sz="4"/>
-            </w:tcBorders>
-            <w:tcMar>
-              <w:top w:type="dxa" w:w="80"/>
-              <w:left w:type="dxa" w:w="120"/>
-              <w:bottom w:type="dxa" w:w="80"/>
-              <w:right w:type="dxa" w:w="120"/>
-            </w:tcMar>
-          </w:tcPr>
-          <w:p>
-            <w:r>
-              <w:rPr>
-                <w:b w:val="false"/>
-                <w:bCs w:val="false"/>
-                <w:sz w:val="20"/>
-                <w:szCs w:val="20"/>
-              </w:rPr>
-              <w:t xml:space="preserve">Team</w:t>
-            </w:r>
-          </w:p>
-        </w:tc>
-        <w:tc>
-          <w:tcPr>
-            <w:tcW w:type="dxa" w:w="4426"/>
-            <w:tcBorders>
-              <w:top w:val="single" w:color="D9D6DE" w:sz="4"/>
-              <w:left w:val="single" w:color="D9D6DE" w:sz="4"/>
-              <w:bottom w:val="single" w:color="D9D6DE" w:sz="4"/>
-              <w:right w:val="single" w:color="D9D6DE" w:sz="4"/>
-            </w:tcBorders>
-            <w:tcMar>
-              <w:top w:type="dxa" w:w="80"/>
-              <w:left w:type="dxa" w:w="120"/>
-              <w:bottom w:type="dxa" w:w="80"/>
-              <w:right w:type="dxa" w:w="120"/>
-            </w:tcMar>
-          </w:tcPr>
-          <w:p>
-            <w:r>
-              <w:rPr>
-                <w:b w:val="false"/>
-                <w:bCs w:val="false"/>
-                <w:sz w:val="20"/>
-                <w:szCs w:val="20"/>
-              </w:rPr>
-              <w:t xml:space="preserve">Role-based views (business, repair, authority), GS1 Digital Link, version history.</w:t>
+              <w:t xml:space="preserve">Review the two other reference projects in the sheet (one US QR-code project). Headless conversion deferred until README work is merged.</w:t>
             </w:r>
           </w:p>
         </w:tc>
@@ -1923,7 +1837,7 @@
         <w:spacing w:after="120" w:before="280"/>
       </w:pPr>
       <w:r>
-        <w:t xml:space="preserve">Why Docker and localhost did not work before</w:t>
+        <w:t xml:space="preserve">How to run for the demo</w:t>
       </w:r>
     </w:p>
     <w:p>
@@ -1936,7 +1850,7 @@
         <w:spacing w:after="60"/>
       </w:pPr>
       <w:r>
-        <w:t xml:space="preserve">The Docker build failed: the husky setup script ran in the production stage, where husky is not installed.</w:t>
+        <w:t xml:space="preserve">Merge PR #6, then click Manual Deploy on Render and wait for “Database schema is up to date” in the logs.</w:t>
       </w:r>
     </w:p>
     <w:p>
@@ -1949,7 +1863,7 @@
         <w:spacing w:after="60"/>
       </w:pPr>
       <w:r>
-        <w:t xml:space="preserve">The server needed dotenv at runtime, but it was only a development dependency.</w:t>
+        <w:t xml:space="preserve">Open the live site, log in, open a product, and download the label.</w:t>
       </w:r>
     </w:p>
     <w:p>
@@ -1962,7 +1876,7 @@
         <w:spacing w:after="60"/>
       </w:pPr>
       <w:r>
-        <w:t xml:space="preserve">The frontend never received the Supabase keys during the Docker build, which gave a blank page.</w:t>
+        <w:t xml:space="preserve">Scan the label’s QR code with a phone: the public passport page opens.</w:t>
       </w:r>
     </w:p>
     <w:p>
@@ -1975,68 +1889,7 @@
         <w:spacing w:after="60"/>
       </w:pPr>
       <w:r>
-        <w:t xml:space="preserve">The Supabase direct database host is IPv6-only, and Docker has no IPv6. The Session pooler URL fixes this.</w:t>
-      </w:r>
-    </w:p>
-    <w:p>
-      <w:pPr>
-        <w:pStyle w:val="Heading1"/>
-        <w:spacing w:after="120" w:before="280"/>
-      </w:pPr>
-      <w:r>
-        <w:t xml:space="preserve">How to run for the demo</w:t>
-      </w:r>
-    </w:p>
-    <w:p>
-      <w:pPr>
-        <w:pStyle w:val="ListParagraph"/>
-        <w:numPr>
-          <w:ilvl w:val="0"/>
-          <w:numId w:val="3"/>
-        </w:numPr>
-        <w:spacing w:after="60"/>
-      </w:pPr>
-      <w:r>
-        <w:t xml:space="preserve">Copy .env.example to .env and fill in the Session pooler DATABASE_URL, BASE_URL and SCANS_EXPORT_KEY.</w:t>
-      </w:r>
-    </w:p>
-    <w:p>
-      <w:pPr>
-        <w:pStyle w:val="ListParagraph"/>
-        <w:numPr>
-          <w:ilvl w:val="0"/>
-          <w:numId w:val="3"/>
-        </w:numPr>
-        <w:spacing w:after="60"/>
-      </w:pPr>
-      <w:r>
-        <w:t xml:space="preserve">Run the two SQL migrations once in the Supabase SQL editor.</w:t>
-      </w:r>
-    </w:p>
-    <w:p>
-      <w:pPr>
-        <w:pStyle w:val="ListParagraph"/>
-        <w:numPr>
-          <w:ilvl w:val="0"/>
-          <w:numId w:val="3"/>
-        </w:numPr>
-        <w:spacing w:after="60"/>
-      </w:pPr>
-      <w:r>
-        <w:t xml:space="preserve">Start: docker compose up -d --build, then open http://&lt;host&gt;:5000.</w:t>
-      </w:r>
-    </w:p>
-    <w:p>
-      <w:pPr>
-        <w:pStyle w:val="ListParagraph"/>
-        <w:numPr>
-          <w:ilvl w:val="0"/>
-          <w:numId w:val="3"/>
-        </w:numPr>
-        <w:spacing w:after="60"/>
-      </w:pPr>
-      <w:r>
-        <w:t xml:space="preserve">Open a product, download the label, scan its QR code with a phone, then refresh the QGIS layer to see the scan.</w:t>
+        <w:t xml:space="preserve">In the product form, click Auto-fetch location, then Preview on map to open Google Maps.</w:t>
       </w:r>
     </w:p>
     <w:p>
@@ -2053,7 +1906,7 @@
         <w:spacing w:after="120"/>
       </w:pPr>
       <w:r>
-        <w:t xml:space="preserve">Type check with 0 errors; Docker image builds and reports healthy; automated browser check of 12 pages on phone and desktop width with no errors; API and storage checks pass. All testing used a separate test database, so the team’s Supabase data was not touched.</w:t>
+        <w:t xml:space="preserve">Type check with 0 errors; Docker image builds and reports healthy; browser check of 12 pages on phone and desktop width with no errors; an automatic scan of 11 pages found no text-only buttons or links (outside the top navigation, tab bars and icon buttons); the downloaded QR PNG decodes to the live site address; storage and migration checks pass. All testing used a separate test database, so the team’s Supabase data was not touched.</w:t>
       </w:r>
     </w:p>
     <w:sectPr>
@@ -2257,12 +2110,6 @@
     </w:lvlOverride>
   </w:num>
   <w:num w:numId="2">
-    <w:abstractNumId w:val="2"/>
-    <w:lvlOverride w:ilvl="0">
-      <w:startOverride w:val="1"/>
-    </w:lvlOverride>
-  </w:num>
-  <w:num w:numId="3">
     <w:abstractNumId w:val="3"/>
     <w:lvlOverride w:ilvl="0">
       <w:startOverride w:val="1"/>

</xml_diff>